<commit_message>
added academic and client closeout documents, updated my personal week 16 logs
</commit_message>
<xml_diff>
--- a/Weekly Logs/Matt/Matt Baker - Week 16 Individual Logbook.docx
+++ b/Weekly Logs/Matt/Matt Baker - Week 16 Individual Logbook.docx
@@ -929,7 +929,7 @@
           <w:r>
             <w:fldChar w:fldCharType="separate"/>
           </w:r>
-          <w:hyperlink w:anchor="_Toc243561885" w:history="1">
+          <w:hyperlink w:anchor="_Toc243986088" w:history="1">
             <w:r>
               <w:rPr>
                 <w:rStyle w:val="Hyperlink"/>
@@ -956,7 +956,7 @@
                 <w:noProof/>
                 <w:webHidden/>
               </w:rPr>
-              <w:instrText xml:space="preserve"> PAGEREF _Toc243561885 \h </w:instrText>
+              <w:instrText xml:space="preserve"> PAGEREF _Toc243986088 \h </w:instrText>
             </w:r>
             <w:r>
               <w:rPr>
@@ -1000,7 +1000,7 @@
               <w:sz w:val="24"/>
             </w:rPr>
           </w:pPr>
-          <w:hyperlink w:anchor="_Toc243561886" w:history="1">
+          <w:hyperlink w:anchor="_Toc243986089" w:history="1">
             <w:r>
               <w:rPr>
                 <w:rStyle w:val="Hyperlink"/>
@@ -1027,7 +1027,7 @@
                 <w:noProof/>
                 <w:webHidden/>
               </w:rPr>
-              <w:instrText xml:space="preserve"> PAGEREF _Toc243561886 \h </w:instrText>
+              <w:instrText xml:space="preserve"> PAGEREF _Toc243986089 \h </w:instrText>
             </w:r>
             <w:r>
               <w:rPr>
@@ -1071,7 +1071,7 @@
               <w:sz w:val="24"/>
             </w:rPr>
           </w:pPr>
-          <w:hyperlink w:anchor="_Toc243561887" w:history="1">
+          <w:hyperlink w:anchor="_Toc243986090" w:history="1">
             <w:r>
               <w:rPr>
                 <w:rStyle w:val="Hyperlink"/>
@@ -1098,7 +1098,7 @@
                 <w:noProof/>
                 <w:webHidden/>
               </w:rPr>
-              <w:instrText xml:space="preserve"> PAGEREF _Toc243561887 \h </w:instrText>
+              <w:instrText xml:space="preserve"> PAGEREF _Toc243986090 \h </w:instrText>
             </w:r>
             <w:r>
               <w:rPr>
@@ -1142,7 +1142,7 @@
               <w:sz w:val="24"/>
             </w:rPr>
           </w:pPr>
-          <w:hyperlink w:anchor="_Toc243561888" w:history="1">
+          <w:hyperlink w:anchor="_Toc243986091" w:history="1">
             <w:r>
               <w:rPr>
                 <w:rStyle w:val="Hyperlink"/>
@@ -1169,7 +1169,7 @@
                 <w:noProof/>
                 <w:webHidden/>
               </w:rPr>
-              <w:instrText xml:space="preserve"> PAGEREF _Toc243561888 \h </w:instrText>
+              <w:instrText xml:space="preserve"> PAGEREF _Toc243986091 \h </w:instrText>
             </w:r>
             <w:r>
               <w:rPr>
@@ -1213,7 +1213,7 @@
               <w:sz w:val="24"/>
             </w:rPr>
           </w:pPr>
-          <w:hyperlink w:anchor="_Toc243561889" w:history="1">
+          <w:hyperlink w:anchor="_Toc243986092" w:history="1">
             <w:r>
               <w:rPr>
                 <w:rStyle w:val="Hyperlink"/>
@@ -1240,7 +1240,7 @@
                 <w:noProof/>
                 <w:webHidden/>
               </w:rPr>
-              <w:instrText xml:space="preserve"> PAGEREF _Toc243561889 \h </w:instrText>
+              <w:instrText xml:space="preserve"> PAGEREF _Toc243986092 \h </w:instrText>
             </w:r>
             <w:r>
               <w:rPr>
@@ -1284,7 +1284,7 @@
               <w:sz w:val="24"/>
             </w:rPr>
           </w:pPr>
-          <w:hyperlink w:anchor="_Toc243561890" w:history="1">
+          <w:hyperlink w:anchor="_Toc243986093" w:history="1">
             <w:r>
               <w:rPr>
                 <w:rStyle w:val="Hyperlink"/>
@@ -1311,7 +1311,7 @@
                 <w:noProof/>
                 <w:webHidden/>
               </w:rPr>
-              <w:instrText xml:space="preserve"> PAGEREF _Toc243561890 \h </w:instrText>
+              <w:instrText xml:space="preserve"> PAGEREF _Toc243986093 \h </w:instrText>
             </w:r>
             <w:r>
               <w:rPr>
@@ -1355,7 +1355,7 @@
               <w:sz w:val="24"/>
             </w:rPr>
           </w:pPr>
-          <w:hyperlink w:anchor="_Toc243561891" w:history="1">
+          <w:hyperlink w:anchor="_Toc243986094" w:history="1">
             <w:r>
               <w:rPr>
                 <w:rStyle w:val="Hyperlink"/>
@@ -1382,7 +1382,7 @@
                 <w:noProof/>
                 <w:webHidden/>
               </w:rPr>
-              <w:instrText xml:space="preserve"> PAGEREF _Toc243561891 \h </w:instrText>
+              <w:instrText xml:space="preserve"> PAGEREF _Toc243986094 \h </w:instrText>
             </w:r>
             <w:r>
               <w:rPr>
@@ -1426,7 +1426,7 @@
               <w:sz w:val="24"/>
             </w:rPr>
           </w:pPr>
-          <w:hyperlink w:anchor="_Toc243561892" w:history="1">
+          <w:hyperlink w:anchor="_Toc243986095" w:history="1">
             <w:r>
               <w:rPr>
                 <w:rStyle w:val="Hyperlink"/>
@@ -1453,7 +1453,7 @@
                 <w:noProof/>
                 <w:webHidden/>
               </w:rPr>
-              <w:instrText xml:space="preserve"> PAGEREF _Toc243561892 \h </w:instrText>
+              <w:instrText xml:space="preserve"> PAGEREF _Toc243986095 \h </w:instrText>
             </w:r>
             <w:r>
               <w:rPr>
@@ -1473,7 +1473,7 @@
                 <w:noProof/>
                 <w:webHidden/>
               </w:rPr>
-              <w:t>6</w:t>
+              <w:t>12</w:t>
             </w:r>
             <w:r>
               <w:rPr>
@@ -1497,7 +1497,7 @@
               <w:sz w:val="24"/>
             </w:rPr>
           </w:pPr>
-          <w:hyperlink w:anchor="_Toc243561893" w:history="1">
+          <w:hyperlink w:anchor="_Toc243986096" w:history="1">
             <w:r>
               <w:rPr>
                 <w:rStyle w:val="Hyperlink"/>
@@ -1524,7 +1524,7 @@
                 <w:noProof/>
                 <w:webHidden/>
               </w:rPr>
-              <w:instrText xml:space="preserve"> PAGEREF _Toc243561893 \h </w:instrText>
+              <w:instrText xml:space="preserve"> PAGEREF _Toc243986096 \h </w:instrText>
             </w:r>
             <w:r>
               <w:rPr>
@@ -1544,7 +1544,7 @@
                 <w:noProof/>
                 <w:webHidden/>
               </w:rPr>
-              <w:t>6</w:t>
+              <w:t>12</w:t>
             </w:r>
             <w:r>
               <w:rPr>
@@ -1737,7 +1737,7 @@
         <w:pStyle w:val="Heading1"/>
         <w:ind w:left="-5"/>
       </w:pPr>
-      <w:bookmarkStart w:id="0" w:name="_Toc243561885"/>
+      <w:bookmarkStart w:id="0" w:name="_Toc243986088"/>
       <w:r>
         <w:lastRenderedPageBreak/>
         <w:t>Hours Breakdown</w:t>
@@ -1852,6 +1852,9 @@
             <w:pPr>
               <w:ind w:left="0" w:firstLine="0"/>
             </w:pPr>
+            <w:r>
+              <w:t>1hr</w:t>
+            </w:r>
           </w:p>
         </w:tc>
       </w:tr>
@@ -1923,6 +1926,54 @@
                 <w:sz w:val="24"/>
               </w:rPr>
               <w:t xml:space="preserve">Advisor meetings </w:t>
+            </w:r>
+          </w:p>
+        </w:tc>
+        <w:tc>
+          <w:tcPr>
+            <w:tcW w:w="3667" w:type="dxa"/>
+            <w:tcBorders>
+              <w:top w:val="single" w:sz="4" w:space="0" w:color="000000"/>
+              <w:left w:val="single" w:sz="4" w:space="0" w:color="000000"/>
+              <w:bottom w:val="single" w:sz="4" w:space="0" w:color="000000"/>
+              <w:right w:val="single" w:sz="4" w:space="0" w:color="000000"/>
+            </w:tcBorders>
+          </w:tcPr>
+          <w:p>
+            <w:pPr>
+              <w:spacing w:after="0" w:line="259" w:lineRule="auto"/>
+              <w:ind w:left="0" w:firstLine="0"/>
+            </w:pPr>
+            <w:r>
+              <w:t>1hr</w:t>
+            </w:r>
+          </w:p>
+        </w:tc>
+      </w:tr>
+      <w:tr>
+        <w:trPr>
+          <w:trHeight w:val="485"/>
+        </w:trPr>
+        <w:tc>
+          <w:tcPr>
+            <w:tcW w:w="4099" w:type="dxa"/>
+            <w:tcBorders>
+              <w:top w:val="single" w:sz="4" w:space="0" w:color="000000"/>
+              <w:left w:val="single" w:sz="4" w:space="0" w:color="000000"/>
+              <w:bottom w:val="single" w:sz="4" w:space="0" w:color="000000"/>
+              <w:right w:val="single" w:sz="4" w:space="0" w:color="000000"/>
+            </w:tcBorders>
+          </w:tcPr>
+          <w:p>
+            <w:pPr>
+              <w:spacing w:after="0" w:line="259" w:lineRule="auto"/>
+              <w:ind w:left="0" w:firstLine="0"/>
+            </w:pPr>
+            <w:r>
+              <w:rPr>
+                <w:sz w:val="24"/>
+              </w:rPr>
+              <w:t xml:space="preserve">Research   </w:t>
             </w:r>
           </w:p>
         </w:tc>
@@ -1967,51 +2018,6 @@
               <w:rPr>
                 <w:sz w:val="24"/>
               </w:rPr>
-              <w:t xml:space="preserve">Research   </w:t>
-            </w:r>
-          </w:p>
-        </w:tc>
-        <w:tc>
-          <w:tcPr>
-            <w:tcW w:w="3667" w:type="dxa"/>
-            <w:tcBorders>
-              <w:top w:val="single" w:sz="4" w:space="0" w:color="000000"/>
-              <w:left w:val="single" w:sz="4" w:space="0" w:color="000000"/>
-              <w:bottom w:val="single" w:sz="4" w:space="0" w:color="000000"/>
-              <w:right w:val="single" w:sz="4" w:space="0" w:color="000000"/>
-            </w:tcBorders>
-          </w:tcPr>
-          <w:p>
-            <w:pPr>
-              <w:spacing w:after="0" w:line="259" w:lineRule="auto"/>
-              <w:ind w:left="0" w:firstLine="0"/>
-            </w:pPr>
-          </w:p>
-        </w:tc>
-      </w:tr>
-      <w:tr>
-        <w:trPr>
-          <w:trHeight w:val="485"/>
-        </w:trPr>
-        <w:tc>
-          <w:tcPr>
-            <w:tcW w:w="4099" w:type="dxa"/>
-            <w:tcBorders>
-              <w:top w:val="single" w:sz="4" w:space="0" w:color="000000"/>
-              <w:left w:val="single" w:sz="4" w:space="0" w:color="000000"/>
-              <w:bottom w:val="single" w:sz="4" w:space="0" w:color="000000"/>
-              <w:right w:val="single" w:sz="4" w:space="0" w:color="000000"/>
-            </w:tcBorders>
-          </w:tcPr>
-          <w:p>
-            <w:pPr>
-              <w:spacing w:after="0" w:line="259" w:lineRule="auto"/>
-              <w:ind w:left="0" w:firstLine="0"/>
-            </w:pPr>
-            <w:r>
-              <w:rPr>
-                <w:sz w:val="24"/>
-              </w:rPr>
               <w:t xml:space="preserve">Development   </w:t>
             </w:r>
           </w:p>
@@ -2124,6 +2130,9 @@
               <w:spacing w:after="0" w:line="259" w:lineRule="auto"/>
               <w:ind w:left="0" w:firstLine="0"/>
             </w:pPr>
+            <w:r>
+              <w:t>14hrs 15min</w:t>
+            </w:r>
           </w:p>
         </w:tc>
       </w:tr>
@@ -2283,6 +2292,12 @@
               </w:rPr>
               <w:t xml:space="preserve"> </w:t>
             </w:r>
+            <w:r>
+              <w:rPr>
+                <w:sz w:val="24"/>
+              </w:rPr>
+              <w:t>8hrs</w:t>
+            </w:r>
           </w:p>
         </w:tc>
       </w:tr>
@@ -2334,6 +2349,9 @@
             <w:pPr>
               <w:spacing w:after="0" w:line="259" w:lineRule="auto"/>
             </w:pPr>
+            <w:r>
+              <w:t>25hrs 15min</w:t>
+            </w:r>
           </w:p>
         </w:tc>
       </w:tr>
@@ -2409,13 +2427,7 @@
               <w:rPr>
                 <w:sz w:val="24"/>
               </w:rPr>
-              <w:t>3</w:t>
-            </w:r>
-            <w:r>
-              <w:rPr>
-                <w:sz w:val="24"/>
-              </w:rPr>
-              <w:t>67</w:t>
+              <w:t>406</w:t>
             </w:r>
             <w:r>
               <w:rPr>
@@ -2504,7 +2516,7 @@
         <w:pStyle w:val="Heading1"/>
         <w:ind w:left="-5"/>
       </w:pPr>
-      <w:bookmarkStart w:id="1" w:name="_Toc243561886"/>
+      <w:bookmarkStart w:id="1" w:name="_Toc243986089"/>
       <w:r>
         <w:lastRenderedPageBreak/>
         <w:t>Completed Content/Documentation</w:t>
@@ -2515,7 +2527,7 @@
       <w:pPr>
         <w:pStyle w:val="Heading2"/>
       </w:pPr>
-      <w:bookmarkStart w:id="2" w:name="_Toc243561887"/>
+      <w:bookmarkStart w:id="2" w:name="_Toc243986090"/>
       <w:r>
         <w:t>Team Meeting</w:t>
       </w:r>
@@ -2526,65 +2538,10 @@
     </w:p>
     <w:p>
       <w:pPr>
-        <w:ind w:left="0" w:firstLine="0"/>
-        <w:rPr>
-          <w:rStyle w:val="Heading2Char"/>
-        </w:rPr>
-      </w:pPr>
-      <w:bookmarkStart w:id="3" w:name="_Toc243561888"/>
-      <w:r>
-        <w:rPr>
-          <w:rStyle w:val="Heading2Char"/>
-        </w:rPr>
-        <w:t>Advi</w:t>
-      </w:r>
-      <w:r>
-        <w:rPr>
-          <w:rStyle w:val="Heading2Char"/>
-        </w:rPr>
-        <w:t>s</w:t>
-      </w:r>
-      <w:r>
-        <w:rPr>
-          <w:rStyle w:val="Heading2Char"/>
-        </w:rPr>
-        <w:t>or Meetings</w:t>
-      </w:r>
-      <w:bookmarkEnd w:id="3"/>
-    </w:p>
-    <w:p>
-      <w:pPr>
-        <w:pStyle w:val="Heading2"/>
-      </w:pPr>
-      <w:bookmarkStart w:id="4" w:name="_Toc243561889"/>
-      <w:r>
-        <w:t>Client Meetings</w:t>
-      </w:r>
-      <w:bookmarkEnd w:id="4"/>
-    </w:p>
-    <w:p>
-      <w:pPr>
-        <w:pStyle w:val="Heading2"/>
-      </w:pPr>
-      <w:bookmarkStart w:id="5" w:name="_Toc243561890"/>
-      <w:r>
-        <w:t>Research</w:t>
-      </w:r>
-      <w:bookmarkEnd w:id="5"/>
-    </w:p>
-    <w:p>
-      <w:pPr>
-        <w:pStyle w:val="Heading2"/>
-      </w:pPr>
-      <w:bookmarkStart w:id="6" w:name="_Toc243561891"/>
-      <w:r>
-        <w:t>Documentation</w:t>
-      </w:r>
-      <w:bookmarkEnd w:id="6"/>
-    </w:p>
-    <w:p>
-      <w:r>
-        <w:t>Monday, October 26</w:t>
+        <w:pStyle w:val="TNR"/>
+      </w:pPr>
+      <w:r>
+        <w:t>Tuesday, October 27</w:t>
       </w:r>
     </w:p>
     <w:p>
@@ -2599,8 +2556,318 @@
           <w:b/>
           <w:bCs/>
         </w:rPr>
+        <w:t xml:space="preserve">10:00 – </w:t>
+      </w:r>
+      <w:r>
+        <w:rPr>
+          <w:b/>
+          <w:bCs/>
+        </w:rPr>
+        <w:t>11</w:t>
+      </w:r>
+      <w:r>
+        <w:rPr>
+          <w:b/>
+          <w:bCs/>
+        </w:rPr>
+        <w:t>:</w:t>
+      </w:r>
+      <w:r>
+        <w:rPr>
+          <w:b/>
+          <w:bCs/>
+        </w:rPr>
+        <w:t>00AM</w:t>
+      </w:r>
+      <w:r>
+        <w:rPr>
+          <w:b/>
+          <w:bCs/>
+        </w:rPr>
+        <w:t xml:space="preserve"> (</w:t>
+      </w:r>
+      <w:r>
+        <w:rPr>
+          <w:b/>
+          <w:bCs/>
+        </w:rPr>
+        <w:t>1hr</w:t>
+      </w:r>
+      <w:r>
+        <w:rPr>
+          <w:b/>
+          <w:bCs/>
+        </w:rPr>
+        <w:t>)</w:t>
+      </w:r>
+    </w:p>
+    <w:p>
+      <w:pPr>
+        <w:pStyle w:val="TNR"/>
+      </w:pPr>
+      <w:r>
+        <w:t xml:space="preserve">Meeting with team after Bryce, </w:t>
+      </w:r>
+      <w:proofErr w:type="spellStart"/>
+      <w:r>
+        <w:t>color</w:t>
+      </w:r>
+      <w:proofErr w:type="spellEnd"/>
+      <w:r>
+        <w:t xml:space="preserve"> picking and advising on shifting elements of the poster together</w:t>
+      </w:r>
+      <w:r>
+        <w:t>, status on pending and finished documents</w:t>
+      </w:r>
+      <w:r>
+        <w:t>.</w:t>
+      </w:r>
+      <w:r>
+        <w:t xml:space="preserve"> New </w:t>
+      </w:r>
+      <w:r>
+        <w:t xml:space="preserve">break-even graphs were suggested. We decided how we wanted to </w:t>
+      </w:r>
+      <w:r>
+        <w:t xml:space="preserve">handle gathering or presenting the data, </w:t>
+      </w:r>
+      <w:r>
+        <w:t xml:space="preserve">discussion on </w:t>
+      </w:r>
+      <w:r>
+        <w:t xml:space="preserve">whether I should </w:t>
+      </w:r>
+      <w:r>
+        <w:t xml:space="preserve">consider </w:t>
+      </w:r>
+      <w:r>
+        <w:t xml:space="preserve">research hours into </w:t>
+      </w:r>
+      <w:r>
+        <w:t xml:space="preserve">script </w:t>
+      </w:r>
+      <w:r>
+        <w:t>development time</w:t>
+      </w:r>
+      <w:r>
+        <w:t xml:space="preserve"> </w:t>
+      </w:r>
+      <w:r>
+        <w:t>when</w:t>
+      </w:r>
+      <w:r>
+        <w:t xml:space="preserve"> presented in the charts</w:t>
+      </w:r>
+      <w:r>
+        <w:t>.</w:t>
+      </w:r>
+    </w:p>
+    <w:p>
+      <w:pPr>
+        <w:ind w:left="0" w:firstLine="0"/>
+        <w:rPr>
+          <w:rStyle w:val="Heading2Char"/>
+        </w:rPr>
+      </w:pPr>
+      <w:bookmarkStart w:id="3" w:name="_Toc243986091"/>
+      <w:r>
+        <w:rPr>
+          <w:rStyle w:val="Heading2Char"/>
+        </w:rPr>
+        <w:t>Advi</w:t>
+      </w:r>
+      <w:r>
+        <w:rPr>
+          <w:rStyle w:val="Heading2Char"/>
+        </w:rPr>
+        <w:t>s</w:t>
+      </w:r>
+      <w:r>
+        <w:rPr>
+          <w:rStyle w:val="Heading2Char"/>
+        </w:rPr>
+        <w:t>or Meetings</w:t>
+      </w:r>
+      <w:bookmarkEnd w:id="3"/>
+    </w:p>
+    <w:p>
+      <w:pPr>
+        <w:pStyle w:val="TNR"/>
+      </w:pPr>
+      <w:r>
+        <w:t>Tuesday, October 27</w:t>
+      </w:r>
+    </w:p>
+    <w:p>
+      <w:pPr>
+        <w:pStyle w:val="TNR"/>
+        <w:rPr>
+          <w:b/>
+          <w:bCs/>
+        </w:rPr>
+      </w:pPr>
+      <w:r>
+        <w:rPr>
+          <w:b/>
+          <w:bCs/>
+        </w:rPr>
+        <w:t xml:space="preserve">9:00 – </w:t>
+      </w:r>
+      <w:r>
+        <w:rPr>
+          <w:b/>
+          <w:bCs/>
+        </w:rPr>
+        <w:t>10:00</w:t>
+      </w:r>
+      <w:r>
+        <w:rPr>
+          <w:b/>
+          <w:bCs/>
+        </w:rPr>
+        <w:t xml:space="preserve"> (1hr)</w:t>
+      </w:r>
+    </w:p>
+    <w:p>
+      <w:pPr>
+        <w:pStyle w:val="TNR"/>
+      </w:pPr>
+      <w:r>
+        <w:t>Meeting with Bryce, all present, how our meeting with Geoff went, advice for final panel, learning outcomes for final panel.</w:t>
+      </w:r>
+      <w:r>
+        <w:t xml:space="preserve"> Presentation design, emphasise what we learned</w:t>
+      </w:r>
+      <w:r>
+        <w:t xml:space="preserve"> during the project, </w:t>
+      </w:r>
+      <w:r>
+        <w:t>AI job interviews</w:t>
+      </w:r>
+      <w:r>
+        <w:t>,</w:t>
+      </w:r>
+      <w:r>
+        <w:t xml:space="preserve"> Tape storage</w:t>
+      </w:r>
+      <w:r>
+        <w:t>.</w:t>
+      </w:r>
+    </w:p>
+    <w:p>
+      <w:pPr>
+        <w:pStyle w:val="Heading2"/>
+      </w:pPr>
+      <w:bookmarkStart w:id="4" w:name="_Toc243986092"/>
+      <w:r>
+        <w:t>Client Meetings</w:t>
+      </w:r>
+      <w:bookmarkEnd w:id="4"/>
+    </w:p>
+    <w:p>
+      <w:pPr>
+        <w:pStyle w:val="Heading2"/>
+      </w:pPr>
+      <w:bookmarkStart w:id="5" w:name="_Toc243986093"/>
+      <w:r>
+        <w:t>Research</w:t>
+      </w:r>
+      <w:bookmarkEnd w:id="5"/>
+    </w:p>
+    <w:p>
+      <w:r>
+        <w:t>No research was completed this week</w:t>
+      </w:r>
+      <w:r>
+        <w:t xml:space="preserve"> by </w:t>
+      </w:r>
+      <w:r>
+        <w:t>W</w:t>
+      </w:r>
+      <w:r>
+        <w:t>ednesday</w:t>
+      </w:r>
+      <w:r>
+        <w:t>.</w:t>
+      </w:r>
+    </w:p>
+    <w:p/>
+    <w:p/>
+    <w:p/>
+    <w:p/>
+    <w:p/>
+    <w:p/>
+    <w:p/>
+    <w:p/>
+    <w:p/>
+    <w:p/>
+    <w:p/>
+    <w:p/>
+    <w:p/>
+    <w:p/>
+    <w:p>
+      <w:pPr>
+        <w:ind w:left="0" w:firstLine="0"/>
+      </w:pPr>
+    </w:p>
+    <w:p>
+      <w:pPr>
+        <w:pStyle w:val="Heading2"/>
+      </w:pPr>
+      <w:bookmarkStart w:id="6" w:name="_Toc243986094"/>
+      <w:r>
+        <w:lastRenderedPageBreak/>
+        <w:t>Documentation</w:t>
+      </w:r>
+      <w:bookmarkEnd w:id="6"/>
+    </w:p>
+    <w:p>
+      <w:r>
+        <w:t>Monday, October 26</w:t>
+      </w:r>
+    </w:p>
+    <w:p>
+      <w:pPr>
+        <w:rPr>
+          <w:b/>
+          <w:bCs/>
+        </w:rPr>
+      </w:pPr>
+      <w:r>
+        <w:rPr>
+          <w:b/>
+          <w:bCs/>
+        </w:rPr>
         <w:t xml:space="preserve">11:45 – </w:t>
       </w:r>
+      <w:r>
+        <w:rPr>
+          <w:b/>
+          <w:bCs/>
+        </w:rPr>
+        <w:t>6:00</w:t>
+      </w:r>
+      <w:r>
+        <w:rPr>
+          <w:b/>
+          <w:bCs/>
+        </w:rPr>
+        <w:t xml:space="preserve"> (6hrs 15</w:t>
+      </w:r>
+      <w:r>
+        <w:rPr>
+          <w:b/>
+          <w:bCs/>
+        </w:rPr>
+        <w:t>min</w:t>
+      </w:r>
+      <w:r>
+        <w:rPr>
+          <w:b/>
+          <w:bCs/>
+        </w:rPr>
+        <w:t>)</w:t>
+      </w:r>
     </w:p>
     <w:p>
       <w:r>
@@ -2612,14 +2879,20 @@
       <w:r>
         <w:t>sourcing documentation for how tools were found and testing was conducted.</w:t>
       </w:r>
-    </w:p>
-    <w:p>
-      <w:r>
+      <w:r>
+        <w:t xml:space="preserve"> All screenshots are work I did.</w:t>
+      </w:r>
+    </w:p>
+    <w:p>
+      <w:r>
+        <w:rPr>
+          <w:noProof/>
+        </w:rPr>
         <w:drawing>
-          <wp:inline distT="0" distB="0" distL="0" distR="0" wp14:anchorId="51039B84" wp14:editId="5F210688">
-            <wp:extent cx="3114136" cy="2276153"/>
-            <wp:effectExtent l="0" t="0" r="0" b="0"/>
-            <wp:docPr id="992158325" name="Picture 1"/>
+          <wp:inline distT="0" distB="0" distL="0" distR="0" wp14:anchorId="6BBC8B01" wp14:editId="67B08630">
+            <wp:extent cx="5141343" cy="6801752"/>
+            <wp:effectExtent l="0" t="0" r="2540" b="0"/>
+            <wp:docPr id="1671409130" name="Picture 1"/>
             <wp:cNvGraphicFramePr>
               <a:graphicFrameLocks xmlns:a="http://schemas.openxmlformats.org/drawingml/2006/main" noChangeAspect="1"/>
             </wp:cNvGraphicFramePr>
@@ -2627,7 +2900,7 @@
               <a:graphicData uri="http://schemas.openxmlformats.org/drawingml/2006/picture">
                 <pic:pic xmlns:pic="http://schemas.openxmlformats.org/drawingml/2006/picture">
                   <pic:nvPicPr>
-                    <pic:cNvPr id="992158325" name=""/>
+                    <pic:cNvPr id="1671409130" name=""/>
                     <pic:cNvPicPr/>
                   </pic:nvPicPr>
                   <pic:blipFill>
@@ -2639,7 +2912,7 @@
                   <pic:spPr>
                     <a:xfrm>
                       <a:off x="0" y="0"/>
-                      <a:ext cx="3116212" cy="2277670"/>
+                      <a:ext cx="5161607" cy="6828560"/>
                     </a:xfrm>
                     <a:prstGeom prst="rect">
                       <a:avLst/>
@@ -2651,6 +2924,57 @@
           </wp:inline>
         </w:drawing>
       </w:r>
+    </w:p>
+    <w:p/>
+    <w:p>
+      <w:r>
+        <w:rPr>
+          <w:noProof/>
+        </w:rPr>
+        <w:lastRenderedPageBreak/>
+        <w:drawing>
+          <wp:inline distT="0" distB="0" distL="0" distR="0" wp14:anchorId="138DF42D" wp14:editId="410E69F7">
+            <wp:extent cx="4027426" cy="2958861"/>
+            <wp:effectExtent l="0" t="0" r="0" b="0"/>
+            <wp:docPr id="510792470" name="Picture 1"/>
+            <wp:cNvGraphicFramePr>
+              <a:graphicFrameLocks xmlns:a="http://schemas.openxmlformats.org/drawingml/2006/main" noChangeAspect="1"/>
+            </wp:cNvGraphicFramePr>
+            <a:graphic xmlns:a="http://schemas.openxmlformats.org/drawingml/2006/main">
+              <a:graphicData uri="http://schemas.openxmlformats.org/drawingml/2006/picture">
+                <pic:pic xmlns:pic="http://schemas.openxmlformats.org/drawingml/2006/picture">
+                  <pic:nvPicPr>
+                    <pic:cNvPr id="510792470" name=""/>
+                    <pic:cNvPicPr/>
+                  </pic:nvPicPr>
+                  <pic:blipFill>
+                    <a:blip r:embed="rId10"/>
+                    <a:stretch>
+                      <a:fillRect/>
+                    </a:stretch>
+                  </pic:blipFill>
+                  <pic:spPr>
+                    <a:xfrm>
+                      <a:off x="0" y="0"/>
+                      <a:ext cx="4036089" cy="2965226"/>
+                    </a:xfrm>
+                    <a:prstGeom prst="rect">
+                      <a:avLst/>
+                    </a:prstGeom>
+                  </pic:spPr>
+                </pic:pic>
+              </a:graphicData>
+            </a:graphic>
+          </wp:inline>
+        </w:drawing>
+      </w:r>
+    </w:p>
+    <w:p>
+      <w:pPr>
+        <w:rPr>
+          <w:noProof/>
+        </w:rPr>
+      </w:pPr>
       <w:r>
         <w:rPr>
           <w:noProof/>
@@ -2658,6 +2982,9 @@
         <w:t xml:space="preserve"> </w:t>
       </w:r>
       <w:r>
+        <w:rPr>
+          <w:noProof/>
+        </w:rPr>
         <w:drawing>
           <wp:inline distT="0" distB="0" distL="0" distR="0" wp14:anchorId="404BC498" wp14:editId="1E1BE297">
             <wp:extent cx="2596551" cy="3433388"/>
@@ -2674,7 +3001,7 @@
                     <pic:cNvPicPr/>
                   </pic:nvPicPr>
                   <pic:blipFill>
-                    <a:blip r:embed="rId10"/>
+                    <a:blip r:embed="rId11"/>
                     <a:stretch>
                       <a:fillRect/>
                     </a:stretch>
@@ -2697,9 +3024,929 @@
     </w:p>
     <w:p>
       <w:pPr>
+        <w:rPr>
+          <w:noProof/>
+        </w:rPr>
+      </w:pPr>
+      <w:r>
+        <w:rPr>
+          <w:noProof/>
+        </w:rPr>
+        <w:t>Also scowering my logs for points where I tested different models.</w:t>
+      </w:r>
+      <w:r>
+        <w:rPr>
+          <w:noProof/>
+        </w:rPr>
+        <w:t xml:space="preserve"> Collecting and annotating evidence of testing. Replaced the project introduction, adapting it for the purposes of this document but making it match the client closeout.</w:t>
+      </w:r>
+    </w:p>
+    <w:p>
+      <w:pPr>
+        <w:rPr>
+          <w:noProof/>
+        </w:rPr>
+      </w:pPr>
+    </w:p>
+    <w:p>
+      <w:pPr>
+        <w:rPr>
+          <w:noProof/>
+        </w:rPr>
+      </w:pPr>
+    </w:p>
+    <w:p>
+      <w:pPr>
+        <w:rPr>
+          <w:noProof/>
+        </w:rPr>
+      </w:pPr>
+    </w:p>
+    <w:p>
+      <w:pPr>
+        <w:rPr>
+          <w:noProof/>
+        </w:rPr>
+      </w:pPr>
+    </w:p>
+    <w:p>
+      <w:pPr>
+        <w:rPr>
+          <w:noProof/>
+        </w:rPr>
+      </w:pPr>
+    </w:p>
+    <w:p>
+      <w:pPr>
+        <w:rPr>
+          <w:noProof/>
+        </w:rPr>
+      </w:pPr>
+      <w:r>
+        <w:rPr>
+          <w:noProof/>
+        </w:rPr>
+        <w:lastRenderedPageBreak/>
+        <w:drawing>
+          <wp:inline distT="0" distB="0" distL="0" distR="0" wp14:anchorId="2ADE832D" wp14:editId="6F616D34">
+            <wp:extent cx="5705019" cy="8298612"/>
+            <wp:effectExtent l="0" t="0" r="0" b="7620"/>
+            <wp:docPr id="1063073741" name="Picture 1"/>
+            <wp:cNvGraphicFramePr>
+              <a:graphicFrameLocks xmlns:a="http://schemas.openxmlformats.org/drawingml/2006/main" noChangeAspect="1"/>
+            </wp:cNvGraphicFramePr>
+            <a:graphic xmlns:a="http://schemas.openxmlformats.org/drawingml/2006/main">
+              <a:graphicData uri="http://schemas.openxmlformats.org/drawingml/2006/picture">
+                <pic:pic xmlns:pic="http://schemas.openxmlformats.org/drawingml/2006/picture">
+                  <pic:nvPicPr>
+                    <pic:cNvPr id="1063073741" name=""/>
+                    <pic:cNvPicPr/>
+                  </pic:nvPicPr>
+                  <pic:blipFill>
+                    <a:blip r:embed="rId12"/>
+                    <a:stretch>
+                      <a:fillRect/>
+                    </a:stretch>
+                  </pic:blipFill>
+                  <pic:spPr>
+                    <a:xfrm>
+                      <a:off x="0" y="0"/>
+                      <a:ext cx="5714561" cy="8312492"/>
+                    </a:xfrm>
+                    <a:prstGeom prst="rect">
+                      <a:avLst/>
+                    </a:prstGeom>
+                  </pic:spPr>
+                </pic:pic>
+              </a:graphicData>
+            </a:graphic>
+          </wp:inline>
+        </w:drawing>
+      </w:r>
+    </w:p>
+    <w:p>
+      <w:pPr>
+        <w:tabs>
+          <w:tab w:val="left" w:pos="2337"/>
+        </w:tabs>
+        <w:ind w:left="0" w:firstLine="0"/>
+        <w:rPr>
+          <w:noProof/>
+        </w:rPr>
+      </w:pPr>
+    </w:p>
+    <w:p>
+      <w:pPr>
+        <w:rPr>
+          <w:noProof/>
+        </w:rPr>
+      </w:pPr>
+      <w:r>
+        <w:rPr>
+          <w:noProof/>
+        </w:rPr>
+        <w:lastRenderedPageBreak/>
+        <w:drawing>
+          <wp:inline distT="0" distB="0" distL="0" distR="0" wp14:anchorId="6701A77B" wp14:editId="0CC0618E">
+            <wp:extent cx="5344799" cy="6849374"/>
+            <wp:effectExtent l="0" t="0" r="8255" b="8890"/>
+            <wp:docPr id="889910016" name="Picture 1"/>
+            <wp:cNvGraphicFramePr>
+              <a:graphicFrameLocks xmlns:a="http://schemas.openxmlformats.org/drawingml/2006/main" noChangeAspect="1"/>
+            </wp:cNvGraphicFramePr>
+            <a:graphic xmlns:a="http://schemas.openxmlformats.org/drawingml/2006/main">
+              <a:graphicData uri="http://schemas.openxmlformats.org/drawingml/2006/picture">
+                <pic:pic xmlns:pic="http://schemas.openxmlformats.org/drawingml/2006/picture">
+                  <pic:nvPicPr>
+                    <pic:cNvPr id="889910016" name=""/>
+                    <pic:cNvPicPr/>
+                  </pic:nvPicPr>
+                  <pic:blipFill>
+                    <a:blip r:embed="rId13"/>
+                    <a:stretch>
+                      <a:fillRect/>
+                    </a:stretch>
+                  </pic:blipFill>
+                  <pic:spPr>
+                    <a:xfrm>
+                      <a:off x="0" y="0"/>
+                      <a:ext cx="5346953" cy="6852134"/>
+                    </a:xfrm>
+                    <a:prstGeom prst="rect">
+                      <a:avLst/>
+                    </a:prstGeom>
+                  </pic:spPr>
+                </pic:pic>
+              </a:graphicData>
+            </a:graphic>
+          </wp:inline>
+        </w:drawing>
+      </w:r>
+    </w:p>
+    <w:p>
+      <w:pPr>
+        <w:rPr>
+          <w:noProof/>
+        </w:rPr>
+      </w:pPr>
+    </w:p>
+    <w:p>
+      <w:pPr>
+        <w:rPr>
+          <w:noProof/>
+        </w:rPr>
+      </w:pPr>
+    </w:p>
+    <w:p>
+      <w:pPr>
+        <w:rPr>
+          <w:noProof/>
+        </w:rPr>
+      </w:pPr>
+      <w:r>
+        <w:rPr>
+          <w:noProof/>
+        </w:rPr>
+        <w:lastRenderedPageBreak/>
+        <w:drawing>
+          <wp:inline distT="0" distB="0" distL="0" distR="0" wp14:anchorId="3B732DFD" wp14:editId="0EDE388E">
+            <wp:extent cx="5729605" cy="8183245"/>
+            <wp:effectExtent l="0" t="0" r="4445" b="8255"/>
+            <wp:docPr id="722560321" name="Picture 1"/>
+            <wp:cNvGraphicFramePr>
+              <a:graphicFrameLocks xmlns:a="http://schemas.openxmlformats.org/drawingml/2006/main" noChangeAspect="1"/>
+            </wp:cNvGraphicFramePr>
+            <a:graphic xmlns:a="http://schemas.openxmlformats.org/drawingml/2006/main">
+              <a:graphicData uri="http://schemas.openxmlformats.org/drawingml/2006/picture">
+                <pic:pic xmlns:pic="http://schemas.openxmlformats.org/drawingml/2006/picture">
+                  <pic:nvPicPr>
+                    <pic:cNvPr id="722560321" name=""/>
+                    <pic:cNvPicPr/>
+                  </pic:nvPicPr>
+                  <pic:blipFill>
+                    <a:blip r:embed="rId14"/>
+                    <a:stretch>
+                      <a:fillRect/>
+                    </a:stretch>
+                  </pic:blipFill>
+                  <pic:spPr>
+                    <a:xfrm>
+                      <a:off x="0" y="0"/>
+                      <a:ext cx="5729605" cy="8183245"/>
+                    </a:xfrm>
+                    <a:prstGeom prst="rect">
+                      <a:avLst/>
+                    </a:prstGeom>
+                  </pic:spPr>
+                </pic:pic>
+              </a:graphicData>
+            </a:graphic>
+          </wp:inline>
+        </w:drawing>
+      </w:r>
+    </w:p>
+    <w:p>
+      <w:pPr>
+        <w:rPr>
+          <w:noProof/>
+        </w:rPr>
+      </w:pPr>
+    </w:p>
+    <w:p>
+      <w:pPr>
+        <w:rPr>
+          <w:noProof/>
+        </w:rPr>
+      </w:pPr>
+    </w:p>
+    <w:p>
+      <w:pPr>
+        <w:rPr>
+          <w:noProof/>
+        </w:rPr>
+      </w:pPr>
+      <w:r>
+        <w:rPr>
+          <w:noProof/>
+        </w:rPr>
+        <w:lastRenderedPageBreak/>
+        <w:drawing>
+          <wp:inline distT="0" distB="0" distL="0" distR="0" wp14:anchorId="378E37B2" wp14:editId="1D4866B1">
+            <wp:extent cx="5729605" cy="5258435"/>
+            <wp:effectExtent l="0" t="0" r="4445" b="0"/>
+            <wp:docPr id="693559091" name="Picture 1"/>
+            <wp:cNvGraphicFramePr>
+              <a:graphicFrameLocks xmlns:a="http://schemas.openxmlformats.org/drawingml/2006/main" noChangeAspect="1"/>
+            </wp:cNvGraphicFramePr>
+            <a:graphic xmlns:a="http://schemas.openxmlformats.org/drawingml/2006/main">
+              <a:graphicData uri="http://schemas.openxmlformats.org/drawingml/2006/picture">
+                <pic:pic xmlns:pic="http://schemas.openxmlformats.org/drawingml/2006/picture">
+                  <pic:nvPicPr>
+                    <pic:cNvPr id="693559091" name=""/>
+                    <pic:cNvPicPr/>
+                  </pic:nvPicPr>
+                  <pic:blipFill>
+                    <a:blip r:embed="rId15"/>
+                    <a:stretch>
+                      <a:fillRect/>
+                    </a:stretch>
+                  </pic:blipFill>
+                  <pic:spPr>
+                    <a:xfrm>
+                      <a:off x="0" y="0"/>
+                      <a:ext cx="5729605" cy="5258435"/>
+                    </a:xfrm>
+                    <a:prstGeom prst="rect">
+                      <a:avLst/>
+                    </a:prstGeom>
+                  </pic:spPr>
+                </pic:pic>
+              </a:graphicData>
+            </a:graphic>
+          </wp:inline>
+        </w:drawing>
+      </w:r>
+    </w:p>
+    <w:p>
+      <w:pPr>
+        <w:rPr>
+          <w:noProof/>
+        </w:rPr>
+      </w:pPr>
+    </w:p>
+    <w:p>
+      <w:pPr>
+        <w:rPr>
+          <w:noProof/>
+        </w:rPr>
+      </w:pPr>
+    </w:p>
+    <w:p>
+      <w:pPr>
+        <w:rPr>
+          <w:noProof/>
+        </w:rPr>
+      </w:pPr>
+    </w:p>
+    <w:p>
+      <w:pPr>
+        <w:rPr>
+          <w:noProof/>
+        </w:rPr>
+      </w:pPr>
+    </w:p>
+    <w:p>
+      <w:pPr>
+        <w:rPr>
+          <w:noProof/>
+        </w:rPr>
+      </w:pPr>
+    </w:p>
+    <w:p>
+      <w:pPr>
+        <w:rPr>
+          <w:noProof/>
+        </w:rPr>
+      </w:pPr>
+    </w:p>
+    <w:p>
+      <w:pPr>
+        <w:rPr>
+          <w:noProof/>
+        </w:rPr>
+      </w:pPr>
+    </w:p>
+    <w:p>
+      <w:pPr>
+        <w:rPr>
+          <w:noProof/>
+        </w:rPr>
+      </w:pPr>
+    </w:p>
+    <w:p>
+      <w:pPr>
+        <w:rPr>
+          <w:noProof/>
+        </w:rPr>
+      </w:pPr>
+    </w:p>
+    <w:p>
+      <w:pPr>
+        <w:rPr>
+          <w:noProof/>
+        </w:rPr>
+      </w:pPr>
+    </w:p>
+    <w:p>
+      <w:pPr>
+        <w:rPr>
+          <w:noProof/>
+        </w:rPr>
+      </w:pPr>
+    </w:p>
+    <w:p>
+      <w:pPr>
+        <w:rPr>
+          <w:noProof/>
+        </w:rPr>
+      </w:pPr>
+    </w:p>
+    <w:p>
+      <w:pPr>
+        <w:rPr>
+          <w:noProof/>
+        </w:rPr>
+      </w:pPr>
+      <w:r>
+        <w:rPr>
+          <w:noProof/>
+        </w:rPr>
+        <w:lastRenderedPageBreak/>
+        <w:drawing>
+          <wp:inline distT="0" distB="0" distL="0" distR="0" wp14:anchorId="28C9D0E0" wp14:editId="44870069">
+            <wp:extent cx="5729605" cy="8262620"/>
+            <wp:effectExtent l="0" t="0" r="4445" b="5080"/>
+            <wp:docPr id="1454886083" name="Picture 1"/>
+            <wp:cNvGraphicFramePr>
+              <a:graphicFrameLocks xmlns:a="http://schemas.openxmlformats.org/drawingml/2006/main" noChangeAspect="1"/>
+            </wp:cNvGraphicFramePr>
+            <a:graphic xmlns:a="http://schemas.openxmlformats.org/drawingml/2006/main">
+              <a:graphicData uri="http://schemas.openxmlformats.org/drawingml/2006/picture">
+                <pic:pic xmlns:pic="http://schemas.openxmlformats.org/drawingml/2006/picture">
+                  <pic:nvPicPr>
+                    <pic:cNvPr id="1454886083" name=""/>
+                    <pic:cNvPicPr/>
+                  </pic:nvPicPr>
+                  <pic:blipFill>
+                    <a:blip r:embed="rId16"/>
+                    <a:stretch>
+                      <a:fillRect/>
+                    </a:stretch>
+                  </pic:blipFill>
+                  <pic:spPr>
+                    <a:xfrm>
+                      <a:off x="0" y="0"/>
+                      <a:ext cx="5729605" cy="8262620"/>
+                    </a:xfrm>
+                    <a:prstGeom prst="rect">
+                      <a:avLst/>
+                    </a:prstGeom>
+                  </pic:spPr>
+                </pic:pic>
+              </a:graphicData>
+            </a:graphic>
+          </wp:inline>
+        </w:drawing>
+      </w:r>
+    </w:p>
+    <w:p>
+      <w:pPr>
+        <w:rPr>
+          <w:noProof/>
+        </w:rPr>
+      </w:pPr>
+    </w:p>
+    <w:p>
+      <w:pPr>
+        <w:rPr>
+          <w:noProof/>
+        </w:rPr>
+      </w:pPr>
+      <w:r>
+        <w:rPr>
+          <w:noProof/>
+        </w:rPr>
+        <w:lastRenderedPageBreak/>
+        <w:drawing>
+          <wp:inline distT="0" distB="0" distL="0" distR="0" wp14:anchorId="32548463" wp14:editId="0461A614">
+            <wp:extent cx="5729605" cy="6544945"/>
+            <wp:effectExtent l="0" t="0" r="4445" b="8255"/>
+            <wp:docPr id="118477189" name="Picture 1"/>
+            <wp:cNvGraphicFramePr>
+              <a:graphicFrameLocks xmlns:a="http://schemas.openxmlformats.org/drawingml/2006/main" noChangeAspect="1"/>
+            </wp:cNvGraphicFramePr>
+            <a:graphic xmlns:a="http://schemas.openxmlformats.org/drawingml/2006/main">
+              <a:graphicData uri="http://schemas.openxmlformats.org/drawingml/2006/picture">
+                <pic:pic xmlns:pic="http://schemas.openxmlformats.org/drawingml/2006/picture">
+                  <pic:nvPicPr>
+                    <pic:cNvPr id="118477189" name=""/>
+                    <pic:cNvPicPr/>
+                  </pic:nvPicPr>
+                  <pic:blipFill>
+                    <a:blip r:embed="rId17"/>
+                    <a:stretch>
+                      <a:fillRect/>
+                    </a:stretch>
+                  </pic:blipFill>
+                  <pic:spPr>
+                    <a:xfrm>
+                      <a:off x="0" y="0"/>
+                      <a:ext cx="5729605" cy="6544945"/>
+                    </a:xfrm>
+                    <a:prstGeom prst="rect">
+                      <a:avLst/>
+                    </a:prstGeom>
+                  </pic:spPr>
+                </pic:pic>
+              </a:graphicData>
+            </a:graphic>
+          </wp:inline>
+        </w:drawing>
+      </w:r>
+    </w:p>
+    <w:p>
+      <w:pPr>
+        <w:rPr>
+          <w:noProof/>
+        </w:rPr>
+      </w:pPr>
+    </w:p>
+    <w:p>
+      <w:pPr>
+        <w:rPr>
+          <w:noProof/>
+        </w:rPr>
+      </w:pPr>
+    </w:p>
+    <w:p>
+      <w:pPr>
+        <w:rPr>
+          <w:noProof/>
+        </w:rPr>
+      </w:pPr>
+    </w:p>
+    <w:p>
+      <w:pPr>
+        <w:rPr>
+          <w:noProof/>
+        </w:rPr>
+      </w:pPr>
+    </w:p>
+    <w:p>
+      <w:pPr>
+        <w:rPr>
+          <w:noProof/>
+        </w:rPr>
+      </w:pPr>
+    </w:p>
+    <w:p>
+      <w:pPr>
+        <w:rPr>
+          <w:noProof/>
+        </w:rPr>
+      </w:pPr>
+    </w:p>
+    <w:p>
+      <w:pPr>
+        <w:rPr>
+          <w:noProof/>
+        </w:rPr>
+      </w:pPr>
+    </w:p>
+    <w:p>
+      <w:pPr>
+        <w:pStyle w:val="TNR"/>
+      </w:pPr>
+      <w:r>
+        <w:lastRenderedPageBreak/>
+        <w:t>Tuesday, October 27</w:t>
+      </w:r>
+    </w:p>
+    <w:p>
+      <w:pPr>
+        <w:pStyle w:val="TNR"/>
+        <w:rPr>
+          <w:b/>
+          <w:bCs/>
+        </w:rPr>
+      </w:pPr>
+      <w:r>
+        <w:rPr>
+          <w:b/>
+          <w:bCs/>
+        </w:rPr>
+        <w:t>11</w:t>
+      </w:r>
+      <w:r>
+        <w:rPr>
+          <w:b/>
+          <w:bCs/>
+        </w:rPr>
+        <w:t>:00</w:t>
+      </w:r>
+      <w:r>
+        <w:rPr>
+          <w:b/>
+          <w:bCs/>
+        </w:rPr>
+        <w:t xml:space="preserve"> – 11</w:t>
+      </w:r>
+      <w:r>
+        <w:rPr>
+          <w:b/>
+          <w:bCs/>
+        </w:rPr>
+        <w:t>:</w:t>
+      </w:r>
+      <w:r>
+        <w:rPr>
+          <w:b/>
+          <w:bCs/>
+        </w:rPr>
+        <w:t>30</w:t>
+      </w:r>
+      <w:r>
+        <w:rPr>
+          <w:b/>
+          <w:bCs/>
+        </w:rPr>
+        <w:t>AM</w:t>
+      </w:r>
+      <w:r>
+        <w:rPr>
+          <w:b/>
+          <w:bCs/>
+        </w:rPr>
+        <w:t xml:space="preserve"> (30min)</w:t>
+      </w:r>
+    </w:p>
+    <w:p>
+      <w:pPr>
+        <w:rPr>
+          <w:noProof/>
+        </w:rPr>
+      </w:pPr>
+      <w:r>
+        <w:rPr>
+          <w:noProof/>
+        </w:rPr>
+        <w:t xml:space="preserve">Scowering my research and logbooks to find the exact development time of my scritps for some supporting break-even </w:t>
+      </w:r>
+      <w:r>
+        <w:rPr>
+          <w:noProof/>
+        </w:rPr>
+        <w:t xml:space="preserve"> comparison </w:t>
+      </w:r>
+      <w:r>
+        <w:rPr>
+          <w:noProof/>
+        </w:rPr>
+        <w:t>graphs that consider that fact.</w:t>
+      </w:r>
+      <w:r>
+        <w:rPr>
+          <w:noProof/>
+        </w:rPr>
+        <w:br/>
+      </w:r>
+      <w:r>
+        <w:rPr>
+          <w:noProof/>
+        </w:rPr>
+        <w:drawing>
+          <wp:inline distT="0" distB="0" distL="0" distR="0" wp14:anchorId="2C22C12B" wp14:editId="728767C2">
+            <wp:extent cx="3191774" cy="3412589"/>
+            <wp:effectExtent l="0" t="0" r="8890" b="0"/>
+            <wp:docPr id="762003480" name="Picture 6"/>
+            <wp:cNvGraphicFramePr>
+              <a:graphicFrameLocks xmlns:a="http://schemas.openxmlformats.org/drawingml/2006/main" noChangeAspect="1"/>
+            </wp:cNvGraphicFramePr>
+            <a:graphic xmlns:a="http://schemas.openxmlformats.org/drawingml/2006/main">
+              <a:graphicData uri="http://schemas.openxmlformats.org/drawingml/2006/picture">
+                <pic:pic xmlns:pic="http://schemas.openxmlformats.org/drawingml/2006/picture">
+                  <pic:nvPicPr>
+                    <pic:cNvPr id="0" name="Picture 2"/>
+                    <pic:cNvPicPr>
+                      <a:picLocks noChangeAspect="1" noChangeArrowheads="1"/>
+                    </pic:cNvPicPr>
+                  </pic:nvPicPr>
+                  <pic:blipFill>
+                    <a:blip r:embed="rId18">
+                      <a:extLst>
+                        <a:ext uri="{28A0092B-C50C-407E-A947-70E740481C1C}">
+                          <a14:useLocalDpi xmlns:a14="http://schemas.microsoft.com/office/drawing/2010/main" val="0"/>
+                        </a:ext>
+                      </a:extLst>
+                    </a:blip>
+                    <a:srcRect/>
+                    <a:stretch>
+                      <a:fillRect/>
+                    </a:stretch>
+                  </pic:blipFill>
+                  <pic:spPr bwMode="auto">
+                    <a:xfrm>
+                      <a:off x="0" y="0"/>
+                      <a:ext cx="3198584" cy="3419870"/>
+                    </a:xfrm>
+                    <a:prstGeom prst="rect">
+                      <a:avLst/>
+                    </a:prstGeom>
+                    <a:noFill/>
+                  </pic:spPr>
+                </pic:pic>
+              </a:graphicData>
+            </a:graphic>
+          </wp:inline>
+        </w:drawing>
+      </w:r>
+    </w:p>
+    <w:p>
+      <w:pPr>
+        <w:pStyle w:val="TNR"/>
+        <w:rPr>
+          <w:b/>
+          <w:bCs/>
+          <w:noProof/>
+        </w:rPr>
+      </w:pPr>
+      <w:r>
+        <w:rPr>
+          <w:b/>
+          <w:bCs/>
+          <w:noProof/>
+        </w:rPr>
+        <w:t>2:</w:t>
+      </w:r>
+      <w:r>
+        <w:rPr>
+          <w:b/>
+          <w:bCs/>
+          <w:noProof/>
+        </w:rPr>
+        <w:t>45</w:t>
+      </w:r>
+      <w:r>
+        <w:rPr>
+          <w:b/>
+          <w:bCs/>
+          <w:noProof/>
+        </w:rPr>
+        <w:t xml:space="preserve"> – </w:t>
+      </w:r>
+      <w:r>
+        <w:rPr>
+          <w:b/>
+          <w:bCs/>
+          <w:noProof/>
+        </w:rPr>
+        <w:t>5</w:t>
+      </w:r>
+      <w:r>
+        <w:rPr>
+          <w:b/>
+          <w:bCs/>
+          <w:noProof/>
+        </w:rPr>
+        <w:t>:</w:t>
+      </w:r>
+      <w:r>
+        <w:rPr>
+          <w:b/>
+          <w:bCs/>
+          <w:noProof/>
+        </w:rPr>
+        <w:t>30</w:t>
+      </w:r>
+      <w:r>
+        <w:rPr>
+          <w:b/>
+          <w:bCs/>
+          <w:noProof/>
+        </w:rPr>
+        <w:t xml:space="preserve"> (2hrs 45 min)</w:t>
+      </w:r>
+    </w:p>
+    <w:p>
+      <w:pPr>
+        <w:pStyle w:val="TNR"/>
+        <w:rPr>
+          <w:noProof/>
+        </w:rPr>
+      </w:pPr>
+      <w:r>
+        <w:rPr>
+          <w:noProof/>
+        </w:rPr>
+        <w:t>Working on the academic closeout report,</w:t>
+      </w:r>
+      <w:r>
+        <w:rPr>
+          <w:noProof/>
+        </w:rPr>
+        <w:t xml:space="preserve"> </w:t>
+      </w:r>
+      <w:r>
+        <w:rPr>
+          <w:noProof/>
+        </w:rPr>
+        <w:t xml:space="preserve">making many small edits to Reflection, Initial Skills, Skills Developed section. Updated testing section intro, </w:t>
+      </w:r>
+      <w:r>
+        <w:rPr>
+          <w:noProof/>
+        </w:rPr>
+        <w:t>wrote about reflection on methodology change.</w:t>
+      </w:r>
+    </w:p>
+    <w:p>
+      <w:pPr>
+        <w:ind w:left="0" w:firstLine="0"/>
+        <w:rPr>
+          <w:b/>
+          <w:bCs/>
+          <w:noProof/>
+        </w:rPr>
+      </w:pPr>
+      <w:r>
+        <w:rPr>
+          <w:b/>
+          <w:bCs/>
+          <w:noProof/>
+        </w:rPr>
+        <w:t>7:15 – 9:45 (3hrs)</w:t>
+      </w:r>
+    </w:p>
+    <w:p>
+      <w:pPr>
+        <w:ind w:left="0" w:firstLine="0"/>
+        <w:rPr>
+          <w:noProof/>
+        </w:rPr>
+      </w:pPr>
+      <w:r>
+        <w:rPr>
+          <w:noProof/>
+        </w:rPr>
+        <w:t xml:space="preserve">More work on academic closeout, </w:t>
+      </w:r>
+      <w:r>
+        <w:rPr>
+          <w:noProof/>
+        </w:rPr>
+        <w:t>mostly effort placed</w:t>
+      </w:r>
+      <w:r>
+        <w:rPr>
+          <w:noProof/>
+        </w:rPr>
+        <w:t xml:space="preserve"> in </w:t>
+      </w:r>
+      <w:r>
+        <w:rPr>
+          <w:noProof/>
+        </w:rPr>
+        <w:t xml:space="preserve">changes in </w:t>
+      </w:r>
+      <w:r>
+        <w:rPr>
+          <w:noProof/>
+        </w:rPr>
+        <w:t>deliverables section.</w:t>
+      </w:r>
+    </w:p>
+    <w:p>
+      <w:pPr>
+        <w:pStyle w:val="TNR"/>
+      </w:pPr>
+      <w:r>
+        <w:t>Wednesday</w:t>
+      </w:r>
+      <w:r>
+        <w:t>, October 2</w:t>
+      </w:r>
+      <w:r>
+        <w:t>8</w:t>
+      </w:r>
+    </w:p>
+    <w:p>
+      <w:pPr>
+        <w:ind w:left="0" w:firstLine="0"/>
+        <w:rPr>
+          <w:b/>
+          <w:bCs/>
+          <w:noProof/>
+        </w:rPr>
+      </w:pPr>
+      <w:r>
+        <w:rPr>
+          <w:b/>
+          <w:bCs/>
+          <w:noProof/>
+        </w:rPr>
+        <w:t xml:space="preserve">8:30 </w:t>
+      </w:r>
+      <w:r>
+        <w:rPr>
+          <w:b/>
+          <w:bCs/>
+          <w:noProof/>
+        </w:rPr>
+        <w:t>–</w:t>
+      </w:r>
+      <w:r>
+        <w:rPr>
+          <w:b/>
+          <w:bCs/>
+          <w:noProof/>
+        </w:rPr>
+        <w:t xml:space="preserve"> </w:t>
+      </w:r>
+      <w:r>
+        <w:rPr>
+          <w:b/>
+          <w:bCs/>
+          <w:noProof/>
+        </w:rPr>
+        <w:t>10:15 (1hr 45min)</w:t>
+      </w:r>
+    </w:p>
+    <w:p>
+      <w:pPr>
+        <w:rPr>
+          <w:noProof/>
+        </w:rPr>
+      </w:pPr>
+      <w:r>
+        <w:rPr>
+          <w:noProof/>
+        </w:rPr>
+        <w:t>Final touches on academic closeout, additions to the deliverable changes, adding proper bryce reference, saving copies that keep comments signifying my contributions</w:t>
+      </w:r>
+      <w:r>
+        <w:rPr>
+          <w:noProof/>
+        </w:rPr>
+        <w:t>, reading over both client and academic closeout.</w:t>
+      </w:r>
+    </w:p>
+    <w:p>
+      <w:pPr>
+        <w:rPr>
+          <w:noProof/>
+        </w:rPr>
+      </w:pPr>
+    </w:p>
+    <w:p>
+      <w:pPr>
+        <w:ind w:left="0" w:firstLine="0"/>
+      </w:pPr>
+    </w:p>
+    <w:p>
+      <w:pPr>
+        <w:ind w:left="0" w:firstLine="0"/>
+      </w:pPr>
+    </w:p>
+    <w:p>
+      <w:pPr>
+        <w:ind w:left="0" w:firstLine="0"/>
+      </w:pPr>
+    </w:p>
+    <w:p>
+      <w:pPr>
         <w:pStyle w:val="Heading2"/>
       </w:pPr>
-      <w:bookmarkStart w:id="7" w:name="_Toc243561892"/>
+      <w:bookmarkStart w:id="7" w:name="_Toc243986095"/>
       <w:r>
         <w:lastRenderedPageBreak/>
         <w:t>Testing</w:t>
@@ -2710,7 +3957,7 @@
       <w:pPr>
         <w:pStyle w:val="Heading2"/>
       </w:pPr>
-      <w:bookmarkStart w:id="8" w:name="_Toc243561893"/>
+      <w:bookmarkStart w:id="8" w:name="_Toc243986096"/>
       <w:r>
         <w:t>Development</w:t>
       </w:r>
@@ -2718,14 +3965,74 @@
     </w:p>
     <w:p>
       <w:pPr>
+        <w:pStyle w:val="Heading2"/>
+      </w:pPr>
+      <w:r>
+        <w:t>Other</w:t>
+      </w:r>
+    </w:p>
+    <w:p>
+      <w:pPr>
         <w:pStyle w:val="TNR"/>
-      </w:pPr>
+        <w:rPr>
+          <w:b/>
+          <w:bCs/>
+        </w:rPr>
+      </w:pPr>
+      <w:r>
+        <w:rPr>
+          <w:b/>
+          <w:bCs/>
+        </w:rPr>
+        <w:t>6 hrs</w:t>
+      </w:r>
+    </w:p>
+    <w:p>
+      <w:pPr>
+        <w:pStyle w:val="TNR"/>
+      </w:pPr>
+      <w:r>
+        <w:t>Preparatory final panel presentation hours.</w:t>
+      </w:r>
+    </w:p>
+    <w:p>
+      <w:pPr>
+        <w:pStyle w:val="TNR"/>
+        <w:rPr>
+          <w:b/>
+          <w:bCs/>
+        </w:rPr>
+      </w:pPr>
+      <w:r>
+        <w:rPr>
+          <w:b/>
+          <w:bCs/>
+        </w:rPr>
+        <w:t>2 hrs</w:t>
+      </w:r>
+    </w:p>
+    <w:p>
+      <w:pPr>
+        <w:pStyle w:val="TNR"/>
+      </w:pPr>
+      <w:r>
+        <w:t xml:space="preserve">Final panel </w:t>
+      </w:r>
+      <w:r>
+        <w:t xml:space="preserve">proper </w:t>
+      </w:r>
+      <w:r>
+        <w:t>presentation hours</w:t>
+      </w:r>
+      <w:r>
+        <w:t>.</w:t>
+      </w:r>
     </w:p>
     <w:sectPr>
-      <w:headerReference w:type="default" r:id="rId11"/>
-      <w:footerReference w:type="even" r:id="rId12"/>
-      <w:footerReference w:type="default" r:id="rId13"/>
-      <w:footerReference w:type="first" r:id="rId14"/>
+      <w:headerReference w:type="default" r:id="rId19"/>
+      <w:footerReference w:type="even" r:id="rId20"/>
+      <w:footerReference w:type="default" r:id="rId21"/>
+      <w:footerReference w:type="first" r:id="rId22"/>
       <w:pgSz w:w="11906" w:h="16838"/>
       <w:pgMar w:top="1483" w:right="1448" w:bottom="1544" w:left="1435" w:header="720" w:footer="730" w:gutter="0"/>
       <w:pgNumType w:start="0"/>

</xml_diff>